<commit_message>
docs: update requirements cover title
</commit_message>
<xml_diff>
--- a/docs/轻量级外卖服务平台-需求文档.docx
+++ b/docs/轻量级外卖服务平台-需求文档.docx
@@ -98,7 +98,7 @@
       </w:pPr>
       <w:bookmarkStart w:id="0" w:name="_Toc240389083"/>
       <w:r>
-        <w:t>软件需求规格说明书</w:t>
+        <w:t>需求文档</w:t>
       </w:r>
       <w:bookmarkEnd w:id="0"/>
     </w:p>
@@ -260,7 +260,7 @@
             <w:rStyle w:val="aff3"/>
             <w:noProof/>
           </w:rPr>
-          <w:t>软件需求规格说明书</w:t>
+          <w:t>需求文档</w:t>
         </w:r>
         <w:r>
           <w:rPr>

</xml_diff>